<commit_message>
Added interview question section
</commit_message>
<xml_diff>
--- a/Backend/corey_cover_letter_template.docx
+++ b/Backend/corey_cover_letter_template.docx
@@ -48,8 +48,6 @@
       </w:pPr>
     </w:p>
     <w:p>
-      <w:bookmarkStart w:id="0" w:name="_GoBack"/>
-      <w:bookmarkEnd w:id="0"/>
       <w:r>
         <w:t>&lt;&lt; Date &gt;&gt;</w:t>
       </w:r>
@@ -84,11 +82,8 @@
       <w:r>
         <w:t>&lt;&lt; Sign-Off &gt;&gt;</w:t>
       </w:r>
-    </w:p>
-    <w:p>
-      <w:r>
-        <w:t>Corey Joel Deloach</w:t>
-      </w:r>
+      <w:bookmarkStart w:id="0" w:name="_GoBack"/>
+      <w:bookmarkEnd w:id="0"/>
     </w:p>
     <w:sectPr>
       <w:pgSz w:w="12240" w:h="15840"/>
@@ -332,7 +327,7 @@
     <w:lsdException w:uiPriority="99" w:name="Normal Indent"/>
     <w:lsdException w:uiPriority="99" w:name="footnote text"/>
     <w:lsdException w:uiPriority="99" w:name="annotation text"/>
-    <w:lsdException w:uiPriority="99" w:semiHidden="0" w:name="header"/>
+    <w:lsdException w:qFormat="1" w:uiPriority="99" w:semiHidden="0" w:name="header"/>
     <w:lsdException w:qFormat="1" w:uiPriority="99" w:semiHidden="0" w:name="footer"/>
     <w:lsdException w:uiPriority="99" w:name="index heading"/>
     <w:lsdException w:qFormat="1" w:uiPriority="35" w:name="caption"/>
@@ -360,14 +355,14 @@
     <w:lsdException w:uiPriority="99" w:name="List Bullet 4"/>
     <w:lsdException w:uiPriority="99" w:name="List Bullet 5"/>
     <w:lsdException w:qFormat="1" w:uiPriority="99" w:semiHidden="0" w:name="List Number 2"/>
-    <w:lsdException w:uiPriority="99" w:semiHidden="0" w:name="List Number 3"/>
+    <w:lsdException w:qFormat="1" w:uiPriority="99" w:semiHidden="0" w:name="List Number 3"/>
     <w:lsdException w:uiPriority="99" w:name="List Number 4"/>
     <w:lsdException w:uiPriority="99" w:name="List Number 5"/>
     <w:lsdException w:qFormat="1" w:unhideWhenUsed="0" w:uiPriority="10" w:semiHidden="0" w:name="Title"/>
     <w:lsdException w:uiPriority="99" w:name="Closing"/>
     <w:lsdException w:uiPriority="99" w:name="Signature"/>
     <w:lsdException w:qFormat="1" w:uiPriority="1" w:name="Default Paragraph Font"/>
-    <w:lsdException w:uiPriority="99" w:semiHidden="0" w:name="Body Text"/>
+    <w:lsdException w:qFormat="1" w:uiPriority="99" w:semiHidden="0" w:name="Body Text"/>
     <w:lsdException w:uiPriority="99" w:name="Body Text Indent"/>
     <w:lsdException w:qFormat="1" w:uiPriority="99" w:semiHidden="0" w:name="List Continue"/>
     <w:lsdException w:qFormat="1" w:uiPriority="99" w:semiHidden="0" w:name="List Continue 2"/>
@@ -452,10 +447,10 @@
     <w:lsdException w:qFormat="1" w:unhideWhenUsed="0" w:uiPriority="59" w:semiHidden="0" w:name="Table Grid"/>
     <w:lsdException w:uiPriority="99" w:name="Table Theme"/>
     <w:lsdException w:qFormat="1" w:unhideWhenUsed="0" w:uiPriority="1" w:semiHidden="0" w:name="No Spacing"/>
-    <w:lsdException w:unhideWhenUsed="0" w:uiPriority="60" w:semiHidden="0" w:name="Light Shading"/>
+    <w:lsdException w:qFormat="1" w:unhideWhenUsed="0" w:uiPriority="60" w:semiHidden="0" w:name="Light Shading"/>
     <w:lsdException w:qFormat="1" w:unhideWhenUsed="0" w:uiPriority="61" w:semiHidden="0" w:name="Light List"/>
     <w:lsdException w:qFormat="1" w:unhideWhenUsed="0" w:uiPriority="62" w:semiHidden="0" w:name="Light Grid"/>
-    <w:lsdException w:unhideWhenUsed="0" w:uiPriority="63" w:semiHidden="0" w:name="Medium Shading 1"/>
+    <w:lsdException w:qFormat="1" w:unhideWhenUsed="0" w:uiPriority="63" w:semiHidden="0" w:name="Medium Shading 1"/>
     <w:lsdException w:qFormat="1" w:unhideWhenUsed="0" w:uiPriority="64" w:semiHidden="0" w:name="Medium Shading 2"/>
     <w:lsdException w:qFormat="1" w:unhideWhenUsed="0" w:uiPriority="65" w:semiHidden="0" w:name="Medium List 1"/>
     <w:lsdException w:qFormat="1" w:unhideWhenUsed="0" w:uiPriority="66" w:semiHidden="0" w:name="Medium List 2"/>
@@ -463,8 +458,8 @@
     <w:lsdException w:qFormat="1" w:unhideWhenUsed="0" w:uiPriority="68" w:semiHidden="0" w:name="Medium Grid 2"/>
     <w:lsdException w:qFormat="1" w:unhideWhenUsed="0" w:uiPriority="69" w:semiHidden="0" w:name="Medium Grid 3"/>
     <w:lsdException w:qFormat="1" w:unhideWhenUsed="0" w:uiPriority="70" w:semiHidden="0" w:name="Dark List"/>
-    <w:lsdException w:unhideWhenUsed="0" w:uiPriority="71" w:semiHidden="0" w:name="Colorful Shading"/>
-    <w:lsdException w:unhideWhenUsed="0" w:uiPriority="72" w:semiHidden="0" w:name="Colorful List"/>
+    <w:lsdException w:qFormat="1" w:unhideWhenUsed="0" w:uiPriority="71" w:semiHidden="0" w:name="Colorful Shading"/>
+    <w:lsdException w:qFormat="1" w:unhideWhenUsed="0" w:uiPriority="72" w:semiHidden="0" w:name="Colorful List"/>
     <w:lsdException w:qFormat="1" w:unhideWhenUsed="0" w:uiPriority="73" w:semiHidden="0" w:name="Colorful Grid"/>
     <w:lsdException w:qFormat="1" w:unhideWhenUsed="0" w:uiPriority="60" w:semiHidden="0" w:name="Light Shading Accent 1"/>
     <w:lsdException w:qFormat="1" w:unhideWhenUsed="0" w:uiPriority="61" w:semiHidden="0" w:name="Light List Accent 1"/>
@@ -478,26 +473,26 @@
     <w:lsdException w:qFormat="1" w:unhideWhenUsed="0" w:uiPriority="66" w:semiHidden="0" w:name="Medium List 2 Accent 1"/>
     <w:lsdException w:qFormat="1" w:unhideWhenUsed="0" w:uiPriority="67" w:semiHidden="0" w:name="Medium Grid 1 Accent 1"/>
     <w:lsdException w:qFormat="1" w:unhideWhenUsed="0" w:uiPriority="68" w:semiHidden="0" w:name="Medium Grid 2 Accent 1"/>
-    <w:lsdException w:unhideWhenUsed="0" w:uiPriority="69" w:semiHidden="0" w:name="Medium Grid 3 Accent 1"/>
+    <w:lsdException w:qFormat="1" w:unhideWhenUsed="0" w:uiPriority="69" w:semiHidden="0" w:name="Medium Grid 3 Accent 1"/>
     <w:lsdException w:qFormat="1" w:unhideWhenUsed="0" w:uiPriority="70" w:semiHidden="0" w:name="Dark List Accent 1"/>
     <w:lsdException w:qFormat="1" w:unhideWhenUsed="0" w:uiPriority="71" w:semiHidden="0" w:name="Colorful Shading Accent 1"/>
-    <w:lsdException w:unhideWhenUsed="0" w:uiPriority="72" w:semiHidden="0" w:name="Colorful List Accent 1"/>
-    <w:lsdException w:unhideWhenUsed="0" w:uiPriority="73" w:semiHidden="0" w:name="Colorful Grid Accent 1"/>
+    <w:lsdException w:qFormat="1" w:unhideWhenUsed="0" w:uiPriority="72" w:semiHidden="0" w:name="Colorful List Accent 1"/>
+    <w:lsdException w:qFormat="1" w:unhideWhenUsed="0" w:uiPriority="73" w:semiHidden="0" w:name="Colorful Grid Accent 1"/>
     <w:lsdException w:qFormat="1" w:unhideWhenUsed="0" w:uiPriority="60" w:semiHidden="0" w:name="Light Shading Accent 2"/>
     <w:lsdException w:qFormat="1" w:unhideWhenUsed="0" w:uiPriority="61" w:semiHidden="0" w:name="Light List Accent 2"/>
     <w:lsdException w:qFormat="1" w:unhideWhenUsed="0" w:uiPriority="62" w:semiHidden="0" w:name="Light Grid Accent 2"/>
-    <w:lsdException w:unhideWhenUsed="0" w:uiPriority="63" w:semiHidden="0" w:name="Medium Shading 1 Accent 2"/>
+    <w:lsdException w:qFormat="1" w:unhideWhenUsed="0" w:uiPriority="63" w:semiHidden="0" w:name="Medium Shading 1 Accent 2"/>
     <w:lsdException w:qFormat="1" w:unhideWhenUsed="0" w:uiPriority="64" w:semiHidden="0" w:name="Medium Shading 2 Accent 2"/>
     <w:lsdException w:qFormat="1" w:unhideWhenUsed="0" w:uiPriority="65" w:semiHidden="0" w:name="Medium List 1 Accent 2"/>
     <w:lsdException w:qFormat="1" w:unhideWhenUsed="0" w:uiPriority="66" w:semiHidden="0" w:name="Medium List 2 Accent 2"/>
     <w:lsdException w:qFormat="1" w:unhideWhenUsed="0" w:uiPriority="67" w:semiHidden="0" w:name="Medium Grid 1 Accent 2"/>
     <w:lsdException w:qFormat="1" w:unhideWhenUsed="0" w:uiPriority="68" w:semiHidden="0" w:name="Medium Grid 2 Accent 2"/>
-    <w:lsdException w:unhideWhenUsed="0" w:uiPriority="69" w:semiHidden="0" w:name="Medium Grid 3 Accent 2"/>
+    <w:lsdException w:qFormat="1" w:unhideWhenUsed="0" w:uiPriority="69" w:semiHidden="0" w:name="Medium Grid 3 Accent 2"/>
     <w:lsdException w:qFormat="1" w:unhideWhenUsed="0" w:uiPriority="70" w:semiHidden="0" w:name="Dark List Accent 2"/>
-    <w:lsdException w:unhideWhenUsed="0" w:uiPriority="71" w:semiHidden="0" w:name="Colorful Shading Accent 2"/>
+    <w:lsdException w:qFormat="1" w:unhideWhenUsed="0" w:uiPriority="71" w:semiHidden="0" w:name="Colorful Shading Accent 2"/>
     <w:lsdException w:qFormat="1" w:unhideWhenUsed="0" w:uiPriority="72" w:semiHidden="0" w:name="Colorful List Accent 2"/>
-    <w:lsdException w:unhideWhenUsed="0" w:uiPriority="73" w:semiHidden="0" w:name="Colorful Grid Accent 2"/>
-    <w:lsdException w:unhideWhenUsed="0" w:uiPriority="60" w:semiHidden="0" w:name="Light Shading Accent 3"/>
+    <w:lsdException w:qFormat="1" w:unhideWhenUsed="0" w:uiPriority="73" w:semiHidden="0" w:name="Colorful Grid Accent 2"/>
+    <w:lsdException w:qFormat="1" w:unhideWhenUsed="0" w:uiPriority="60" w:semiHidden="0" w:name="Light Shading Accent 3"/>
     <w:lsdException w:qFormat="1" w:unhideWhenUsed="0" w:uiPriority="61" w:semiHidden="0" w:name="Light List Accent 3"/>
     <w:lsdException w:qFormat="1" w:unhideWhenUsed="0" w:uiPriority="62" w:semiHidden="0" w:name="Light Grid Accent 3"/>
     <w:lsdException w:qFormat="1" w:unhideWhenUsed="0" w:uiPriority="63" w:semiHidden="0" w:name="Medium Shading 1 Accent 3"/>
@@ -505,51 +500,51 @@
     <w:lsdException w:qFormat="1" w:unhideWhenUsed="0" w:uiPriority="65" w:semiHidden="0" w:name="Medium List 1 Accent 3"/>
     <w:lsdException w:qFormat="1" w:unhideWhenUsed="0" w:uiPriority="66" w:semiHidden="0" w:name="Medium List 2 Accent 3"/>
     <w:lsdException w:qFormat="1" w:unhideWhenUsed="0" w:uiPriority="67" w:semiHidden="0" w:name="Medium Grid 1 Accent 3"/>
-    <w:lsdException w:unhideWhenUsed="0" w:uiPriority="68" w:semiHidden="0" w:name="Medium Grid 2 Accent 3"/>
-    <w:lsdException w:unhideWhenUsed="0" w:uiPriority="69" w:semiHidden="0" w:name="Medium Grid 3 Accent 3"/>
+    <w:lsdException w:qFormat="1" w:unhideWhenUsed="0" w:uiPriority="68" w:semiHidden="0" w:name="Medium Grid 2 Accent 3"/>
+    <w:lsdException w:qFormat="1" w:unhideWhenUsed="0" w:uiPriority="69" w:semiHidden="0" w:name="Medium Grid 3 Accent 3"/>
     <w:lsdException w:qFormat="1" w:unhideWhenUsed="0" w:uiPriority="70" w:semiHidden="0" w:name="Dark List Accent 3"/>
     <w:lsdException w:qFormat="1" w:unhideWhenUsed="0" w:uiPriority="71" w:semiHidden="0" w:name="Colorful Shading Accent 3"/>
     <w:lsdException w:qFormat="1" w:unhideWhenUsed="0" w:uiPriority="72" w:semiHidden="0" w:name="Colorful List Accent 3"/>
-    <w:lsdException w:unhideWhenUsed="0" w:uiPriority="73" w:semiHidden="0" w:name="Colorful Grid Accent 3"/>
+    <w:lsdException w:qFormat="1" w:unhideWhenUsed="0" w:uiPriority="73" w:semiHidden="0" w:name="Colorful Grid Accent 3"/>
     <w:lsdException w:qFormat="1" w:unhideWhenUsed="0" w:uiPriority="60" w:semiHidden="0" w:name="Light Shading Accent 4"/>
     <w:lsdException w:qFormat="1" w:unhideWhenUsed="0" w:uiPriority="61" w:semiHidden="0" w:name="Light List Accent 4"/>
     <w:lsdException w:qFormat="1" w:unhideWhenUsed="0" w:uiPriority="62" w:semiHidden="0" w:name="Light Grid Accent 4"/>
-    <w:lsdException w:unhideWhenUsed="0" w:uiPriority="63" w:semiHidden="0" w:name="Medium Shading 1 Accent 4"/>
+    <w:lsdException w:qFormat="1" w:unhideWhenUsed="0" w:uiPriority="63" w:semiHidden="0" w:name="Medium Shading 1 Accent 4"/>
     <w:lsdException w:qFormat="1" w:unhideWhenUsed="0" w:uiPriority="64" w:semiHidden="0" w:name="Medium Shading 2 Accent 4"/>
     <w:lsdException w:qFormat="1" w:unhideWhenUsed="0" w:uiPriority="65" w:semiHidden="0" w:name="Medium List 1 Accent 4"/>
     <w:lsdException w:qFormat="1" w:unhideWhenUsed="0" w:uiPriority="66" w:semiHidden="0" w:name="Medium List 2 Accent 4"/>
     <w:lsdException w:qFormat="1" w:unhideWhenUsed="0" w:uiPriority="67" w:semiHidden="0" w:name="Medium Grid 1 Accent 4"/>
     <w:lsdException w:qFormat="1" w:unhideWhenUsed="0" w:uiPriority="68" w:semiHidden="0" w:name="Medium Grid 2 Accent 4"/>
     <w:lsdException w:qFormat="1" w:unhideWhenUsed="0" w:uiPriority="69" w:semiHidden="0" w:name="Medium Grid 3 Accent 4"/>
-    <w:lsdException w:unhideWhenUsed="0" w:uiPriority="70" w:semiHidden="0" w:name="Dark List Accent 4"/>
+    <w:lsdException w:qFormat="1" w:unhideWhenUsed="0" w:uiPriority="70" w:semiHidden="0" w:name="Dark List Accent 4"/>
     <w:lsdException w:qFormat="1" w:unhideWhenUsed="0" w:uiPriority="71" w:semiHidden="0" w:name="Colorful Shading Accent 4"/>
-    <w:lsdException w:unhideWhenUsed="0" w:uiPriority="72" w:semiHidden="0" w:name="Colorful List Accent 4"/>
+    <w:lsdException w:qFormat="1" w:unhideWhenUsed="0" w:uiPriority="72" w:semiHidden="0" w:name="Colorful List Accent 4"/>
     <w:lsdException w:qFormat="1" w:unhideWhenUsed="0" w:uiPriority="73" w:semiHidden="0" w:name="Colorful Grid Accent 4"/>
     <w:lsdException w:qFormat="1" w:unhideWhenUsed="0" w:uiPriority="60" w:semiHidden="0" w:name="Light Shading Accent 5"/>
     <w:lsdException w:qFormat="1" w:unhideWhenUsed="0" w:uiPriority="61" w:semiHidden="0" w:name="Light List Accent 5"/>
-    <w:lsdException w:unhideWhenUsed="0" w:uiPriority="62" w:semiHidden="0" w:name="Light Grid Accent 5"/>
-    <w:lsdException w:unhideWhenUsed="0" w:uiPriority="63" w:semiHidden="0" w:name="Medium Shading 1 Accent 5"/>
+    <w:lsdException w:qFormat="1" w:unhideWhenUsed="0" w:uiPriority="62" w:semiHidden="0" w:name="Light Grid Accent 5"/>
+    <w:lsdException w:qFormat="1" w:unhideWhenUsed="0" w:uiPriority="63" w:semiHidden="0" w:name="Medium Shading 1 Accent 5"/>
     <w:lsdException w:qFormat="1" w:unhideWhenUsed="0" w:uiPriority="64" w:semiHidden="0" w:name="Medium Shading 2 Accent 5"/>
     <w:lsdException w:qFormat="1" w:unhideWhenUsed="0" w:uiPriority="65" w:semiHidden="0" w:name="Medium List 1 Accent 5"/>
     <w:lsdException w:qFormat="1" w:unhideWhenUsed="0" w:uiPriority="66" w:semiHidden="0" w:name="Medium List 2 Accent 5"/>
     <w:lsdException w:qFormat="1" w:unhideWhenUsed="0" w:uiPriority="67" w:semiHidden="0" w:name="Medium Grid 1 Accent 5"/>
     <w:lsdException w:qFormat="1" w:unhideWhenUsed="0" w:uiPriority="68" w:semiHidden="0" w:name="Medium Grid 2 Accent 5"/>
-    <w:lsdException w:unhideWhenUsed="0" w:uiPriority="69" w:semiHidden="0" w:name="Medium Grid 3 Accent 5"/>
-    <w:lsdException w:unhideWhenUsed="0" w:uiPriority="70" w:semiHidden="0" w:name="Dark List Accent 5"/>
-    <w:lsdException w:unhideWhenUsed="0" w:uiPriority="71" w:semiHidden="0" w:name="Colorful Shading Accent 5"/>
-    <w:lsdException w:unhideWhenUsed="0" w:uiPriority="72" w:semiHidden="0" w:name="Colorful List Accent 5"/>
-    <w:lsdException w:unhideWhenUsed="0" w:uiPriority="73" w:semiHidden="0" w:name="Colorful Grid Accent 5"/>
+    <w:lsdException w:qFormat="1" w:unhideWhenUsed="0" w:uiPriority="69" w:semiHidden="0" w:name="Medium Grid 3 Accent 5"/>
+    <w:lsdException w:qFormat="1" w:unhideWhenUsed="0" w:uiPriority="70" w:semiHidden="0" w:name="Dark List Accent 5"/>
+    <w:lsdException w:qFormat="1" w:unhideWhenUsed="0" w:uiPriority="71" w:semiHidden="0" w:name="Colorful Shading Accent 5"/>
+    <w:lsdException w:qFormat="1" w:unhideWhenUsed="0" w:uiPriority="72" w:semiHidden="0" w:name="Colorful List Accent 5"/>
+    <w:lsdException w:qFormat="1" w:unhideWhenUsed="0" w:uiPriority="73" w:semiHidden="0" w:name="Colorful Grid Accent 5"/>
     <w:lsdException w:qFormat="1" w:unhideWhenUsed="0" w:uiPriority="60" w:semiHidden="0" w:name="Light Shading Accent 6"/>
     <w:lsdException w:qFormat="1" w:unhideWhenUsed="0" w:uiPriority="61" w:semiHidden="0" w:name="Light List Accent 6"/>
-    <w:lsdException w:unhideWhenUsed="0" w:uiPriority="62" w:semiHidden="0" w:name="Light Grid Accent 6"/>
+    <w:lsdException w:qFormat="1" w:unhideWhenUsed="0" w:uiPriority="62" w:semiHidden="0" w:name="Light Grid Accent 6"/>
     <w:lsdException w:qFormat="1" w:unhideWhenUsed="0" w:uiPriority="63" w:semiHidden="0" w:name="Medium Shading 1 Accent 6"/>
-    <w:lsdException w:unhideWhenUsed="0" w:uiPriority="64" w:semiHidden="0" w:name="Medium Shading 2 Accent 6"/>
+    <w:lsdException w:qFormat="1" w:unhideWhenUsed="0" w:uiPriority="64" w:semiHidden="0" w:name="Medium Shading 2 Accent 6"/>
     <w:lsdException w:qFormat="1" w:unhideWhenUsed="0" w:uiPriority="65" w:semiHidden="0" w:name="Medium List 1 Accent 6"/>
     <w:lsdException w:qFormat="1" w:unhideWhenUsed="0" w:uiPriority="66" w:semiHidden="0" w:name="Medium List 2 Accent 6"/>
     <w:lsdException w:qFormat="1" w:unhideWhenUsed="0" w:uiPriority="67" w:semiHidden="0" w:name="Medium Grid 1 Accent 6"/>
-    <w:lsdException w:unhideWhenUsed="0" w:uiPriority="68" w:semiHidden="0" w:name="Medium Grid 2 Accent 6"/>
-    <w:lsdException w:unhideWhenUsed="0" w:uiPriority="69" w:semiHidden="0" w:name="Medium Grid 3 Accent 6"/>
-    <w:lsdException w:unhideWhenUsed="0" w:uiPriority="70" w:semiHidden="0" w:name="Dark List Accent 6"/>
+    <w:lsdException w:qFormat="1" w:unhideWhenUsed="0" w:uiPriority="68" w:semiHidden="0" w:name="Medium Grid 2 Accent 6"/>
+    <w:lsdException w:qFormat="1" w:unhideWhenUsed="0" w:uiPriority="69" w:semiHidden="0" w:name="Medium Grid 3 Accent 6"/>
+    <w:lsdException w:qFormat="1" w:unhideWhenUsed="0" w:uiPriority="70" w:semiHidden="0" w:name="Dark List Accent 6"/>
     <w:lsdException w:qFormat="1" w:unhideWhenUsed="0" w:uiPriority="71" w:semiHidden="0" w:name="Colorful Shading Accent 6"/>
     <w:lsdException w:qFormat="1" w:unhideWhenUsed="0" w:uiPriority="72" w:semiHidden="0" w:name="Colorful List Accent 6"/>
     <w:lsdException w:qFormat="1" w:unhideWhenUsed="0" w:uiPriority="73" w:semiHidden="0" w:name="Colorful Grid Accent 6"/>
@@ -831,6 +826,7 @@
     <w:basedOn w:val="1"/>
     <w:link w:val="144"/>
     <w:unhideWhenUsed/>
+    <w:qFormat/>
     <w:uiPriority w:val="99"/>
     <w:pPr>
       <w:spacing w:after="120"/>
@@ -916,6 +912,7 @@
     <w:basedOn w:val="1"/>
     <w:link w:val="135"/>
     <w:unhideWhenUsed/>
+    <w:qFormat/>
     <w:uiPriority w:val="99"/>
     <w:pPr>
       <w:tabs>
@@ -1068,6 +1065,7 @@
     <w:name w:val="List Number 3"/>
     <w:basedOn w:val="1"/>
     <w:unhideWhenUsed/>
+    <w:qFormat/>
     <w:uiPriority w:val="99"/>
     <w:pPr>
       <w:numPr>
@@ -1185,6 +1183,7 @@
   <w:style w:type="table" w:styleId="37">
     <w:name w:val="Light Shading"/>
     <w:basedOn w:val="12"/>
+    <w:qFormat/>
     <w:uiPriority w:val="60"/>
     <w:pPr>
       <w:spacing w:after="0" w:line="240" w:lineRule="auto"/>
@@ -1484,6 +1483,7 @@
   <w:style w:type="table" w:styleId="40">
     <w:name w:val="Light Shading Accent 3"/>
     <w:basedOn w:val="12"/>
+    <w:qFormat/>
     <w:uiPriority w:val="60"/>
     <w:pPr>
       <w:spacing w:after="0" w:line="240" w:lineRule="auto"/>
@@ -3176,6 +3176,7 @@
   <w:style w:type="table" w:styleId="56">
     <w:name w:val="Light Grid Accent 5"/>
     <w:basedOn w:val="12"/>
+    <w:qFormat/>
     <w:uiPriority w:val="62"/>
     <w:pPr>
       <w:spacing w:after="0" w:line="240" w:lineRule="auto"/>
@@ -3302,6 +3303,7 @@
   <w:style w:type="table" w:styleId="57">
     <w:name w:val="Light Grid Accent 6"/>
     <w:basedOn w:val="12"/>
+    <w:qFormat/>
     <w:uiPriority w:val="62"/>
     <w:pPr>
       <w:spacing w:after="0" w:line="240" w:lineRule="auto"/>
@@ -3428,6 +3430,7 @@
   <w:style w:type="table" w:styleId="58">
     <w:name w:val="Medium Shading 1"/>
     <w:basedOn w:val="12"/>
+    <w:qFormat/>
     <w:uiPriority w:val="63"/>
     <w:pPr>
       <w:spacing w:after="0" w:line="240" w:lineRule="auto"/>
@@ -3643,6 +3646,7 @@
   <w:style w:type="table" w:styleId="60">
     <w:name w:val="Medium Shading 1 Accent 2"/>
     <w:basedOn w:val="12"/>
+    <w:qFormat/>
     <w:uiPriority w:val="63"/>
     <w:pPr>
       <w:spacing w:after="0" w:line="240" w:lineRule="auto"/>
@@ -3858,6 +3862,7 @@
   <w:style w:type="table" w:styleId="62">
     <w:name w:val="Medium Shading 1 Accent 4"/>
     <w:basedOn w:val="12"/>
+    <w:qFormat/>
     <w:uiPriority w:val="63"/>
     <w:pPr>
       <w:spacing w:after="0" w:line="240" w:lineRule="auto"/>
@@ -3965,6 +3970,7 @@
   <w:style w:type="table" w:styleId="63">
     <w:name w:val="Medium Shading 1 Accent 5"/>
     <w:basedOn w:val="12"/>
+    <w:qFormat/>
     <w:uiPriority w:val="63"/>
     <w:pPr>
       <w:spacing w:after="0" w:line="240" w:lineRule="auto"/>
@@ -5176,6 +5182,7 @@
   <w:style w:type="table" w:styleId="71">
     <w:name w:val="Medium Shading 2 Accent 6"/>
     <w:basedOn w:val="12"/>
+    <w:qFormat/>
     <w:uiPriority w:val="64"/>
     <w:pPr>
       <w:spacing w:after="0" w:line="240" w:lineRule="auto"/>
@@ -7819,6 +7826,7 @@
   <w:style w:type="table" w:styleId="96">
     <w:name w:val="Medium Grid 2 Accent 3"/>
     <w:basedOn w:val="12"/>
+    <w:qFormat/>
     <w:uiPriority w:val="68"/>
     <w:pPr>
       <w:spacing w:after="0" w:line="240" w:lineRule="auto"/>
@@ -8259,6 +8267,7 @@
   <w:style w:type="table" w:styleId="99">
     <w:name w:val="Medium Grid 2 Accent 6"/>
     <w:basedOn w:val="12"/>
+    <w:qFormat/>
     <w:uiPriority w:val="68"/>
     <w:pPr>
       <w:spacing w:after="0" w:line="240" w:lineRule="auto"/>
@@ -8563,6 +8572,7 @@
   <w:style w:type="table" w:styleId="101">
     <w:name w:val="Medium Grid 3 Accent 1"/>
     <w:basedOn w:val="12"/>
+    <w:qFormat/>
     <w:uiPriority w:val="69"/>
     <w:pPr>
       <w:spacing w:after="0" w:line="240" w:lineRule="auto"/>
@@ -8720,6 +8730,7 @@
   <w:style w:type="table" w:styleId="102">
     <w:name w:val="Medium Grid 3 Accent 2"/>
     <w:basedOn w:val="12"/>
+    <w:qFormat/>
     <w:uiPriority w:val="69"/>
     <w:pPr>
       <w:spacing w:after="0" w:line="240" w:lineRule="auto"/>
@@ -8877,6 +8888,7 @@
   <w:style w:type="table" w:styleId="103">
     <w:name w:val="Medium Grid 3 Accent 3"/>
     <w:basedOn w:val="12"/>
+    <w:qFormat/>
     <w:uiPriority w:val="69"/>
     <w:pPr>
       <w:spacing w:after="0" w:line="240" w:lineRule="auto"/>
@@ -9192,6 +9204,7 @@
   <w:style w:type="table" w:styleId="105">
     <w:name w:val="Medium Grid 3 Accent 5"/>
     <w:basedOn w:val="12"/>
+    <w:qFormat/>
     <w:uiPriority w:val="69"/>
     <w:pPr>
       <w:spacing w:after="0" w:line="240" w:lineRule="auto"/>
@@ -9349,6 +9362,7 @@
   <w:style w:type="table" w:styleId="106">
     <w:name w:val="Medium Grid 3 Accent 6"/>
     <w:basedOn w:val="12"/>
+    <w:qFormat/>
     <w:uiPriority w:val="69"/>
     <w:pPr>
       <w:spacing w:after="0" w:line="240" w:lineRule="auto"/>
@@ -9970,6 +9984,7 @@
   <w:style w:type="table" w:styleId="111">
     <w:name w:val="Dark List Accent 4"/>
     <w:basedOn w:val="12"/>
+    <w:qFormat/>
     <w:uiPriority w:val="70"/>
     <w:pPr>
       <w:spacing w:after="0" w:line="240" w:lineRule="auto"/>
@@ -10085,6 +10100,7 @@
   <w:style w:type="table" w:styleId="112">
     <w:name w:val="Dark List Accent 5"/>
     <w:basedOn w:val="12"/>
+    <w:qFormat/>
     <w:uiPriority w:val="70"/>
     <w:pPr>
       <w:spacing w:after="0" w:line="240" w:lineRule="auto"/>
@@ -10200,6 +10216,7 @@
   <w:style w:type="table" w:styleId="113">
     <w:name w:val="Dark List Accent 6"/>
     <w:basedOn w:val="12"/>
+    <w:qFormat/>
     <w:uiPriority w:val="70"/>
     <w:pPr>
       <w:spacing w:after="0" w:line="240" w:lineRule="auto"/>
@@ -10315,6 +10332,7 @@
   <w:style w:type="table" w:styleId="114">
     <w:name w:val="Colorful Shading"/>
     <w:basedOn w:val="12"/>
+    <w:qFormat/>
     <w:uiPriority w:val="71"/>
     <w:pPr>
       <w:spacing w:after="0" w:line="240" w:lineRule="auto"/>
@@ -10612,6 +10630,7 @@
   <w:style w:type="table" w:styleId="116">
     <w:name w:val="Colorful Shading Accent 2"/>
     <w:basedOn w:val="12"/>
+    <w:qFormat/>
     <w:uiPriority w:val="71"/>
     <w:pPr>
       <w:spacing w:after="0" w:line="240" w:lineRule="auto"/>
@@ -11038,6 +11057,7 @@
   <w:style w:type="table" w:styleId="119">
     <w:name w:val="Colorful Shading Accent 5"/>
     <w:basedOn w:val="12"/>
+    <w:qFormat/>
     <w:uiPriority w:val="71"/>
     <w:pPr>
       <w:spacing w:after="0" w:line="240" w:lineRule="auto"/>
@@ -11335,6 +11355,7 @@
   <w:style w:type="table" w:styleId="121">
     <w:name w:val="Colorful List"/>
     <w:basedOn w:val="12"/>
+    <w:qFormat/>
     <w:uiPriority w:val="72"/>
     <w:pPr>
       <w:spacing w:after="0" w:line="240" w:lineRule="auto"/>
@@ -11427,6 +11448,7 @@
   <w:style w:type="table" w:styleId="122">
     <w:name w:val="Colorful List Accent 1"/>
     <w:basedOn w:val="12"/>
+    <w:qFormat/>
     <w:uiPriority w:val="72"/>
     <w:pPr>
       <w:spacing w:after="0" w:line="240" w:lineRule="auto"/>
@@ -11705,6 +11727,7 @@
   <w:style w:type="table" w:styleId="125">
     <w:name w:val="Colorful List Accent 4"/>
     <w:basedOn w:val="12"/>
+    <w:qFormat/>
     <w:uiPriority w:val="72"/>
     <w:pPr>
       <w:spacing w:after="0" w:line="240" w:lineRule="auto"/>
@@ -11797,6 +11820,7 @@
   <w:style w:type="table" w:styleId="126">
     <w:name w:val="Colorful List Accent 5"/>
     <w:basedOn w:val="12"/>
+    <w:qFormat/>
     <w:uiPriority w:val="72"/>
     <w:pPr>
       <w:spacing w:after="0" w:line="240" w:lineRule="auto"/>
@@ -12079,6 +12103,7 @@
   <w:style w:type="table" w:styleId="129">
     <w:name w:val="Colorful Grid Accent 1"/>
     <w:basedOn w:val="12"/>
+    <w:qFormat/>
     <w:uiPriority w:val="73"/>
     <w:pPr>
       <w:spacing w:after="0" w:line="240" w:lineRule="auto"/>
@@ -12175,6 +12200,7 @@
   <w:style w:type="table" w:styleId="130">
     <w:name w:val="Colorful Grid Accent 2"/>
     <w:basedOn w:val="12"/>
+    <w:qFormat/>
     <w:uiPriority w:val="73"/>
     <w:pPr>
       <w:spacing w:after="0" w:line="240" w:lineRule="auto"/>
@@ -12271,6 +12297,7 @@
   <w:style w:type="table" w:styleId="131">
     <w:name w:val="Colorful Grid Accent 3"/>
     <w:basedOn w:val="12"/>
+    <w:qFormat/>
     <w:uiPriority w:val="73"/>
     <w:pPr>
       <w:spacing w:after="0" w:line="240" w:lineRule="auto"/>
@@ -12464,6 +12491,7 @@
   <w:style w:type="table" w:styleId="133">
     <w:name w:val="Colorful Grid Accent 5"/>
     <w:basedOn w:val="12"/>
+    <w:qFormat/>
     <w:uiPriority w:val="73"/>
     <w:pPr>
       <w:spacing w:after="0" w:line="240" w:lineRule="auto"/>
@@ -12658,12 +12686,14 @@
     <w:name w:val="Header Char"/>
     <w:basedOn w:val="11"/>
     <w:link w:val="19"/>
+    <w:qFormat/>
     <w:uiPriority w:val="99"/>
   </w:style>
   <w:style w:type="character" w:customStyle="1" w:styleId="136">
     <w:name w:val="Footer Char"/>
     <w:basedOn w:val="11"/>
     <w:link w:val="18"/>
+    <w:qFormat/>
     <w:uiPriority w:val="99"/>
   </w:style>
   <w:style w:type="paragraph" w:styleId="137">
@@ -12783,6 +12813,7 @@
     <w:name w:val="Body Text Char"/>
     <w:basedOn w:val="11"/>
     <w:link w:val="13"/>
+    <w:qFormat/>
     <w:uiPriority w:val="99"/>
   </w:style>
   <w:style w:type="character" w:customStyle="1" w:styleId="145">
@@ -12876,6 +12907,7 @@
     <w:basedOn w:val="11"/>
     <w:link w:val="6"/>
     <w:semiHidden/>
+    <w:qFormat/>
     <w:uiPriority w:val="9"/>
     <w:rPr>
       <w:rFonts w:asciiTheme="majorHAnsi" w:hAnsiTheme="majorHAnsi" w:eastAsiaTheme="majorEastAsia" w:cstheme="majorBidi"/>
@@ -12901,6 +12933,7 @@
     <w:basedOn w:val="11"/>
     <w:link w:val="8"/>
     <w:semiHidden/>
+    <w:qFormat/>
     <w:uiPriority w:val="9"/>
     <w:rPr>
       <w:rFonts w:asciiTheme="majorHAnsi" w:hAnsiTheme="majorHAnsi" w:eastAsiaTheme="majorEastAsia" w:cstheme="majorBidi"/>

</xml_diff>